<commit_message>
chore: auto-push #83 [2026-10-08 13:13]
</commit_message>
<xml_diff>
--- a/Landing_Page/Landing Page Copywriting.docx
+++ b/Landing_Page/Landing Page Copywriting.docx
@@ -3,21 +3,12 @@
 <w:document xmlns:wpc="http://schemas.microsoft.com/office/word/2010/wordprocessingCanvas" xmlns:cx="http://schemas.microsoft.com/office/drawing/2014/chartex" xmlns:cx1="http://schemas.microsoft.com/office/drawing/2015/9/8/chartex" xmlns:cx2="http://schemas.microsoft.com/office/drawing/2015/10/21/chartex" xmlns:cx3="http://schemas.microsoft.com/office/drawing/2016/5/9/chartex" xmlns:cx4="http://schemas.microsoft.com/office/drawing/2016/5/10/chartex" xmlns:cx5="http://schemas.microsoft.com/office/drawing/2016/5/11/chartex" xmlns:cx6="http://schemas.microsoft.com/office/drawing/2016/5/12/chartex" xmlns:cx7="http://schemas.microsoft.com/office/drawing/2016/5/13/chartex" xmlns:cx8="http://schemas.microsoft.com/office/drawing/2016/5/14/chartex" xmlns:mc="http://schemas.openxmlformats.org/markup-compatibility/2006" xmlns:aink="http://schemas.microsoft.com/office/drawing/2016/ink" xmlns:am3d="http://schemas.microsoft.com/office/drawing/2017/model3d" xmlns:o="urn:schemas-microsoft-com:office:office" xmlns:oel="http://schemas.microsoft.com/office/2019/extlst" xmlns:r="http://schemas.openxmlformats.org/officeDocument/2006/relationships" xmlns:m="http://schemas.openxmlformats.org/officeDocument/2006/math" xmlns:v="urn:schemas-microsoft-com:vml" xmlns:wp14="http://schemas.microsoft.com/office/word/2010/wordprocessingDrawing" xmlns:wp="http://schemas.openxmlformats.org/drawingml/2006/wordprocessingDrawing" xmlns:w10="urn:schemas-microsoft-com:office:word" xmlns:w="http://schemas.openxmlformats.org/wordprocessingml/2006/main" xmlns:w14="http://schemas.microsoft.com/office/word/2010/wordml" xmlns:w15="http://schemas.microsoft.com/office/word/2012/wordml" xmlns:w16cex="http://schemas.microsoft.com/office/word/2018/wordml/cex" xmlns:w16cid="http://schemas.microsoft.com/office/word/2016/wordml/cid" xmlns:w16="http://schemas.microsoft.com/office/word/2018/wordml" xmlns:w16du="http://schemas.microsoft.com/office/word/2023/wordml/word16du" xmlns:w16sdtdh="http://schemas.microsoft.com/office/word/2020/wordml/sdtdatahash" xmlns:w16sdtfl="http://schemas.microsoft.com/office/word/2024/wordml/sdtformatlock" xmlns:w16se="http://schemas.microsoft.com/office/word/2015/wordml/symex" xmlns:wpg="http://schemas.microsoft.com/office/word/2010/wordprocessingGroup" xmlns:wpi="http://schemas.microsoft.com/office/word/2010/wordprocessingInk" xmlns:wne="http://schemas.microsoft.com/office/word/2006/wordml" xmlns:wps="http://schemas.microsoft.com/office/word/2010/wordprocessingShape" mc:Ignorable="w14 w15 w16se w16cid w16 w16cex w16sdtdh w16sdtfl w16du wp14">
   <w:body>
     <w:p>
-      <w:proofErr w:type="spellStart"/>
-      <w:r>
-        <w:rPr>
-          <w:b/>
-          <w:bCs/>
-        </w:rPr>
-        <w:t>Greenstreets</w:t>
-      </w:r>
-      <w:proofErr w:type="spellEnd"/>
-      <w:r>
-        <w:rPr>
-          <w:b/>
-          <w:bCs/>
-        </w:rPr>
-        <w:t xml:space="preserve"> — PPWR Landing Page </w:t>
+      <w:r>
+        <w:rPr>
+          <w:b/>
+          <w:bCs/>
+        </w:rPr>
+        <w:t xml:space="preserve">Greenstreets — PPWR Landing Page </w:t>
       </w:r>
     </w:p>
     <w:p>
@@ -56,21 +47,6 @@
           <w:b/>
           <w:bCs/>
         </w:rPr>
-        <w:t>PPWR Easy &amp; Simple // PPWR Seamless Compliance</w:t>
-      </w:r>
-    </w:p>
-    <w:p>
-      <w:pPr>
-        <w:rPr>
-          <w:b/>
-          <w:bCs/>
-        </w:rPr>
-      </w:pPr>
-      <w:r>
-        <w:rPr>
-          <w:b/>
-          <w:bCs/>
-        </w:rPr>
         <w:t>PPWR Made Easy</w:t>
       </w:r>
       <w:r>
@@ -78,29 +54,7 @@
           <w:b/>
           <w:bCs/>
         </w:rPr>
-        <w:t xml:space="preserve"> // The Fastest path to PPWR Compliance</w:t>
-      </w:r>
-    </w:p>
-    <w:p>
-      <w:pPr>
-        <w:rPr>
-          <w:b/>
-          <w:bCs/>
-        </w:rPr>
-      </w:pPr>
-      <w:r>
-        <w:rPr>
-          <w:b/>
-          <w:bCs/>
-        </w:rPr>
-        <w:t>The ultimate platform for PPWR</w:t>
-      </w:r>
-      <w:r>
-        <w:rPr>
-          <w:b/>
-          <w:bCs/>
-        </w:rPr>
-        <w:t xml:space="preserve"> // </w:t>
+        <w:t xml:space="preserve"> </w:t>
       </w:r>
     </w:p>
     <w:p/>
@@ -161,30 +115,6 @@
     </w:p>
     <w:p>
       <w:pPr>
-        <w:rPr>
-          <w:b/>
-          <w:bCs/>
-        </w:rPr>
-      </w:pPr>
-    </w:p>
-    <w:p/>
-    <w:p>
-      <w:pPr>
-        <w:rPr>
-          <w:b/>
-          <w:bCs/>
-        </w:rPr>
-      </w:pPr>
-      <w:r>
-        <w:rPr>
-          <w:b/>
-          <w:bCs/>
-        </w:rPr>
-        <w:t>Wherever you are located in the chain, your data is valuable.</w:t>
-      </w:r>
-    </w:p>
-    <w:p>
-      <w:pPr>
         <w:pBdr>
           <w:bottom w:val="double" w:sz="6" w:space="1" w:color="auto"/>
         </w:pBdr>
@@ -193,14 +123,6 @@
         <w:t>The same product can pass through manufacturers, importers, distributors and retailers. Each step depends on accurate packaging data — and each connection is a chance to make the next request easier.</w:t>
       </w:r>
     </w:p>
-    <w:p>
-      <w:pPr>
-        <w:rPr>
-          <w:b/>
-          <w:bCs/>
-        </w:rPr>
-      </w:pPr>
-    </w:p>
     <w:p/>
     <w:p>
       <w:r>
@@ -240,24 +162,6 @@
         <w:t>Less room for errors.</w:t>
       </w:r>
     </w:p>
-    <w:p>
-      <w:pPr>
-        <w:pBdr>
-          <w:bottom w:val="double" w:sz="6" w:space="1" w:color="auto"/>
-        </w:pBdr>
-        <w:rPr>
-          <w:b/>
-          <w:bCs/>
-        </w:rPr>
-      </w:pPr>
-      <w:r>
-        <w:rPr>
-          <w:b/>
-          <w:bCs/>
-        </w:rPr>
-        <w:t>CTA: Build your packaging library</w:t>
-      </w:r>
-    </w:p>
     <w:p/>
     <w:p>
       <w:r>
@@ -272,7 +176,6 @@
           <w:b/>
           <w:bCs/>
         </w:rPr>
-        <w:t xml:space="preserve"> / Supplier Vault</w:t>
       </w:r>
     </w:p>
     <w:p>
@@ -289,98 +192,35 @@
         <w:t>Send clear requests to suppliers, see what’s missing, track what’s complete and keep the whole audit trail together.</w:t>
       </w:r>
     </w:p>
-    <w:p>
-      <w:pPr>
-        <w:pBdr>
-          <w:bottom w:val="double" w:sz="6" w:space="1" w:color="auto"/>
-        </w:pBdr>
-        <w:rPr>
-          <w:b/>
-          <w:bCs/>
-        </w:rPr>
-      </w:pPr>
-      <w:r>
-        <w:rPr>
-          <w:b/>
-          <w:bCs/>
-        </w:rPr>
-        <w:t>CTA: Manage supplier requests</w:t>
-      </w:r>
-    </w:p>
     <w:p/>
     <w:p>
-      <w:r>
-        <w:rPr>
-          <w:b/>
-          <w:bCs/>
-        </w:rPr>
-        <w:t>Grow your network</w:t>
-      </w:r>
-      <w:r>
-        <w:rPr>
-          <w:b/>
-          <w:bCs/>
-        </w:rPr>
-        <w:t xml:space="preserve"> //</w:t>
-      </w:r>
-    </w:p>
-    <w:p>
-      <w:r>
-        <w:rPr>
-          <w:b/>
-          <w:bCs/>
-        </w:rPr>
-        <w:t>manage your suppliers. Build your network.</w:t>
-      </w:r>
-    </w:p>
-    <w:p>
-      <w:r>
-        <w:t>Invite the suppliers you already work with, then keep extending your network as your business grows. One connection can lead to the next — making it easier to collect data, work with partners and respond to customer requests.</w:t>
-      </w:r>
-    </w:p>
-    <w:p>
-      <w:r>
-        <w:t>Connect more suppliers.</w:t>
-      </w:r>
-    </w:p>
-    <w:p>
-      <w:r>
-        <w:t>Keep supplier information in one place.</w:t>
-      </w:r>
-    </w:p>
-    <w:p>
-      <w:r>
-        <w:t>Make every new relationship easier to manage.</w:t>
-      </w:r>
-    </w:p>
-    <w:p>
-      <w:pPr>
-        <w:pBdr>
-          <w:bottom w:val="double" w:sz="6" w:space="1" w:color="auto"/>
-        </w:pBdr>
-        <w:rPr>
-          <w:b/>
-          <w:bCs/>
-        </w:rPr>
-      </w:pPr>
-      <w:r>
-        <w:rPr>
-          <w:b/>
-          <w:bCs/>
-        </w:rPr>
-        <w:t>CTA: Grow your supplier network</w:t>
-      </w:r>
-    </w:p>
-    <w:p>
-      <w:pPr>
-        <w:pBdr>
-          <w:bottom w:val="double" w:sz="6" w:space="1" w:color="auto"/>
-        </w:pBdr>
-        <w:rPr>
-          <w:b/>
-          <w:bCs/>
-        </w:rPr>
-      </w:pPr>
+      <w:pPr>
+        <w:rPr>
+          <w:b/>
+          <w:bCs/>
+        </w:rPr>
+      </w:pPr>
+      <w:r>
+        <w:rPr>
+          <w:b/>
+          <w:bCs/>
+        </w:rPr>
+        <w:t>The chain grows</w:t>
+      </w:r>
+    </w:p>
+    <w:p>
+      <w:r>
+        <w:rPr>
+          <w:b/>
+          <w:bCs/>
+        </w:rPr>
+        <w:t>Every new connection makes the next one easier.</w:t>
+      </w:r>
+    </w:p>
+    <w:p>
+      <w:r>
+        <w:t>When your customer invites you in, you can invite your suppliers too. As more of the chain joins, packaging data becomes easier to collect, share and reuse — and your network keeps growing with it.</w:t>
+      </w:r>
     </w:p>
     <w:p/>
     <w:p>
@@ -389,122 +229,12 @@
           <w:b/>
           <w:bCs/>
         </w:rPr>
-        <w:t>Less chasing. More connections. More business-ready data.</w:t>
-      </w:r>
-    </w:p>
-    <w:p>
-      <w:r>
-        <w:lastRenderedPageBreak/>
-        <w:t>Bring your PPWR data, supplier requests and records into one place, so compliance takes less time while your network becomes easier to build and manage.</w:t>
-      </w:r>
-    </w:p>
-    <w:p>
-      <w:pPr>
-        <w:rPr>
-          <w:b/>
-          <w:bCs/>
-        </w:rPr>
-      </w:pPr>
-      <w:r>
-        <w:rPr>
-          <w:b/>
-          <w:bCs/>
-        </w:rPr>
-        <w:t>The chain grows</w:t>
-      </w:r>
-    </w:p>
-    <w:p>
-      <w:pPr>
-        <w:pBdr>
-          <w:bottom w:val="double" w:sz="6" w:space="1" w:color="auto"/>
-        </w:pBdr>
-        <w:rPr>
-          <w:b/>
-          <w:bCs/>
-        </w:rPr>
-      </w:pPr>
-    </w:p>
-    <w:p>
-      <w:pPr>
-        <w:rPr>
-          <w:b/>
-          <w:bCs/>
-        </w:rPr>
-      </w:pPr>
-    </w:p>
-    <w:p/>
-    <w:p>
-      <w:r>
-        <w:rPr>
-          <w:b/>
-          <w:bCs/>
-        </w:rPr>
-        <w:t>Every new connection makes the next one easier.</w:t>
-      </w:r>
-    </w:p>
-    <w:p>
-      <w:r>
-        <w:t>When your customer invites you in, you can invite your suppliers too. As more of the chain joins, packaging data becomes easier to collect, share and reuse — and your network keeps growing with it.</w:t>
-      </w:r>
-    </w:p>
-    <w:p>
-      <w:pPr>
-        <w:pBdr>
-          <w:bottom w:val="double" w:sz="6" w:space="1" w:color="auto"/>
-        </w:pBdr>
-        <w:rPr>
-          <w:b/>
-          <w:bCs/>
-        </w:rPr>
-      </w:pPr>
-      <w:r>
-        <w:rPr>
-          <w:b/>
-          <w:bCs/>
-        </w:rPr>
-        <w:t>CTA: Build your chain</w:t>
-      </w:r>
-    </w:p>
-    <w:p>
-      <w:pPr>
-        <w:pBdr>
-          <w:bottom w:val="double" w:sz="6" w:space="1" w:color="auto"/>
-        </w:pBdr>
-        <w:rPr>
-          <w:b/>
-          <w:bCs/>
-        </w:rPr>
-      </w:pPr>
-    </w:p>
-    <w:p>
-      <w:pPr>
-        <w:rPr>
-          <w:b/>
-          <w:bCs/>
-        </w:rPr>
-      </w:pPr>
-    </w:p>
-    <w:p/>
-    <w:p>
-      <w:r>
-        <w:rPr>
-          <w:b/>
-          <w:bCs/>
-        </w:rPr>
         <w:t>Your customers will ask for packaging data. Be ready before they do.</w:t>
       </w:r>
     </w:p>
     <w:p>
       <w:r>
-        <w:t xml:space="preserve">See how </w:t>
-      </w:r>
-      <w:proofErr w:type="spellStart"/>
-      <w:r>
-        <w:t>Greenstreets</w:t>
-      </w:r>
-      <w:proofErr w:type="spellEnd"/>
-      <w:r>
-        <w:t xml:space="preserve"> can help you stay ready, connect more suppliers and make your next business relationship easier to manage. It takes 20 minutes.</w:t>
+        <w:t>See how Greenstreets can help you stay ready, connect more suppliers and make your next business relationship easier to manage. It takes 20 minutes.</w:t>
       </w:r>
     </w:p>
     <w:p>
@@ -522,44 +252,6 @@
         <w:t>CTA: Book a demo</w:t>
       </w:r>
     </w:p>
-    <w:p>
-      <w:pPr>
-        <w:pBdr>
-          <w:bottom w:val="double" w:sz="6" w:space="1" w:color="auto"/>
-        </w:pBdr>
-        <w:rPr>
-          <w:b/>
-          <w:bCs/>
-        </w:rPr>
-      </w:pPr>
-    </w:p>
-    <w:p/>
-    <w:p>
-      <w:r>
-        <w:rPr>
-          <w:b/>
-          <w:bCs/>
-        </w:rPr>
-        <w:t>Inside the product</w:t>
-      </w:r>
-    </w:p>
-    <w:p>
-      <w:r>
-        <w:t>Packaging Library — Fill it in once. Share it whenever it’s needed. [Find out more]</w:t>
-      </w:r>
-    </w:p>
-    <w:p>
-      <w:r>
-        <w:t>Supplier Hub — Get the data you need without the chasing. [Find out more]</w:t>
-      </w:r>
-    </w:p>
-    <w:p>
-      <w:r>
-        <w:t>Network Growth — Connect more suppliers and make every new relationship easier to manage. [Find out more]</w:t>
-      </w:r>
-    </w:p>
-    <w:p/>
-    <w:p/>
     <w:sectPr>
       <w:pgSz w:w="11906" w:h="16838"/>
       <w:pgMar w:top="1440" w:right="1440" w:bottom="1440" w:left="1440" w:header="708" w:footer="708" w:gutter="0"/>
@@ -1162,6 +854,7 @@
   <w:style w:type="character" w:default="1" w:styleId="DefaultParagraphFont">
     <w:name w:val="Default Paragraph Font"/>
     <w:uiPriority w:val="1"/>
+    <w:semiHidden/>
     <w:unhideWhenUsed/>
   </w:style>
   <w:style w:type="table" w:default="1" w:styleId="TableNormal">

</xml_diff>